<commit_message>
Tutorial k6: carpeta de cada terminal y la Terminal 3 para la prueba del login
Co-Authored-By: Claude Opus 5.5 <noreply@anthropic.com>
</commit_message>
<xml_diff>
--- a/docs/pruebas/informe-k6/LeGrandHotel_Tutorial_k6.docx
+++ b/docs/pruebas/informe-k6/LeGrandHotel_Tutorial_k6.docx
@@ -34,7 +34,7 @@
           <w:noProof/>
         </w:rPr>
         <w:drawing>
-          <wp:inline distT="0" distB="0" distL="0" distR="0" wp14:anchorId="07A9A394" wp14:editId="11F512C7">
+          <wp:inline distT="0" distB="0" distL="0" distR="0" wp14:anchorId="7300F9B8" wp14:editId="07790B1F">
             <wp:extent cx="1800225" cy="1076325"/>
             <wp:effectExtent l="0" t="0" r="0" b="0"/>
             <wp:docPr id="1" name="Imagen 1"/>
@@ -254,7 +254,7 @@
     <w:sdt>
       <w:sdtPr>
         <w:alias w:val="Índice"/>
-        <w:id w:val="-390580187"/>
+        <w:id w:val="-1505826462"/>
       </w:sdtPr>
       <w:sdtEndPr/>
       <w:sdtContent>
@@ -280,7 +280,7 @@
           <w:r>
             <w:fldChar w:fldCharType="separate"/>
           </w:r>
-          <w:hyperlink w:anchor="_Toc244027120" w:history="1">
+          <w:hyperlink w:anchor="_Toc244027720" w:history="1">
             <w:r>
               <w:rPr>
                 <w:rStyle w:val="Hipervnculo"/>
@@ -304,7 +304,7 @@
               <w:rPr>
                 <w:noProof/>
               </w:rPr>
-              <w:instrText xml:space="preserve"> PAGEREF _Toc244027120 \h </w:instrText>
+              <w:instrText xml:space="preserve"> PAGEREF _Toc244027720 \h </w:instrText>
             </w:r>
             <w:r>
               <w:rPr>
@@ -344,7 +344,7 @@
               <w14:ligatures w14:val="standardContextual"/>
             </w:rPr>
           </w:pPr>
-          <w:hyperlink w:anchor="_Toc244027121" w:history="1">
+          <w:hyperlink w:anchor="_Toc244027721" w:history="1">
             <w:r>
               <w:rPr>
                 <w:rStyle w:val="Hipervnculo"/>
@@ -368,7 +368,7 @@
               <w:rPr>
                 <w:noProof/>
               </w:rPr>
-              <w:instrText xml:space="preserve"> PAGEREF _Toc244027121 \h </w:instrText>
+              <w:instrText xml:space="preserve"> PAGEREF _Toc244027721 \h </w:instrText>
             </w:r>
             <w:r>
               <w:rPr>
@@ -408,7 +408,7 @@
               <w14:ligatures w14:val="standardContextual"/>
             </w:rPr>
           </w:pPr>
-          <w:hyperlink w:anchor="_Toc244027122" w:history="1">
+          <w:hyperlink w:anchor="_Toc244027722" w:history="1">
             <w:r>
               <w:rPr>
                 <w:rStyle w:val="Hipervnculo"/>
@@ -432,7 +432,7 @@
               <w:rPr>
                 <w:noProof/>
               </w:rPr>
-              <w:instrText xml:space="preserve"> PAGEREF _Toc244027122 \h </w:instrText>
+              <w:instrText xml:space="preserve"> PAGEREF _Toc244027722 \h </w:instrText>
             </w:r>
             <w:r>
               <w:rPr>
@@ -472,7 +472,7 @@
               <w14:ligatures w14:val="standardContextual"/>
             </w:rPr>
           </w:pPr>
-          <w:hyperlink w:anchor="_Toc244027123" w:history="1">
+          <w:hyperlink w:anchor="_Toc244027723" w:history="1">
             <w:r>
               <w:rPr>
                 <w:rStyle w:val="Hipervnculo"/>
@@ -496,7 +496,7 @@
               <w:rPr>
                 <w:noProof/>
               </w:rPr>
-              <w:instrText xml:space="preserve"> PAGEREF _Toc244027123 \h </w:instrText>
+              <w:instrText xml:space="preserve"> PAGEREF _Toc244027723 \h </w:instrText>
             </w:r>
             <w:r>
               <w:rPr>
@@ -536,7 +536,7 @@
               <w14:ligatures w14:val="standardContextual"/>
             </w:rPr>
           </w:pPr>
-          <w:hyperlink w:anchor="_Toc244027124" w:history="1">
+          <w:hyperlink w:anchor="_Toc244027724" w:history="1">
             <w:r>
               <w:rPr>
                 <w:rStyle w:val="Hipervnculo"/>
@@ -560,7 +560,7 @@
               <w:rPr>
                 <w:noProof/>
               </w:rPr>
-              <w:instrText xml:space="preserve"> PAGEREF _Toc244027124 \h </w:instrText>
+              <w:instrText xml:space="preserve"> PAGEREF _Toc244027724 \h </w:instrText>
             </w:r>
             <w:r>
               <w:rPr>
@@ -600,7 +600,7 @@
               <w14:ligatures w14:val="standardContextual"/>
             </w:rPr>
           </w:pPr>
-          <w:hyperlink w:anchor="_Toc244027125" w:history="1">
+          <w:hyperlink w:anchor="_Toc244027725" w:history="1">
             <w:r>
               <w:rPr>
                 <w:rStyle w:val="Hipervnculo"/>
@@ -624,7 +624,7 @@
               <w:rPr>
                 <w:noProof/>
               </w:rPr>
-              <w:instrText xml:space="preserve"> PAGEREF _Toc244027125 \h </w:instrText>
+              <w:instrText xml:space="preserve"> PAGEREF _Toc244027725 \h </w:instrText>
             </w:r>
             <w:r>
               <w:rPr>
@@ -664,7 +664,7 @@
               <w14:ligatures w14:val="standardContextual"/>
             </w:rPr>
           </w:pPr>
-          <w:hyperlink w:anchor="_Toc244027126" w:history="1">
+          <w:hyperlink w:anchor="_Toc244027726" w:history="1">
             <w:r>
               <w:rPr>
                 <w:rStyle w:val="Hipervnculo"/>
@@ -688,7 +688,7 @@
               <w:rPr>
                 <w:noProof/>
               </w:rPr>
-              <w:instrText xml:space="preserve"> PAGEREF _Toc244027126 \h </w:instrText>
+              <w:instrText xml:space="preserve"> PAGEREF _Toc244027726 \h </w:instrText>
             </w:r>
             <w:r>
               <w:rPr>
@@ -728,7 +728,7 @@
               <w14:ligatures w14:val="standardContextual"/>
             </w:rPr>
           </w:pPr>
-          <w:hyperlink w:anchor="_Toc244027127" w:history="1">
+          <w:hyperlink w:anchor="_Toc244027727" w:history="1">
             <w:r>
               <w:rPr>
                 <w:rStyle w:val="Hipervnculo"/>
@@ -752,7 +752,7 @@
               <w:rPr>
                 <w:noProof/>
               </w:rPr>
-              <w:instrText xml:space="preserve"> PAGEREF _Toc244027127 \h </w:instrText>
+              <w:instrText xml:space="preserve"> PAGEREF _Toc244027727 \h </w:instrText>
             </w:r>
             <w:r>
               <w:rPr>
@@ -792,7 +792,7 @@
               <w14:ligatures w14:val="standardContextual"/>
             </w:rPr>
           </w:pPr>
-          <w:hyperlink w:anchor="_Toc244027128" w:history="1">
+          <w:hyperlink w:anchor="_Toc244027728" w:history="1">
             <w:r>
               <w:rPr>
                 <w:rStyle w:val="Hipervnculo"/>
@@ -816,7 +816,7 @@
               <w:rPr>
                 <w:noProof/>
               </w:rPr>
-              <w:instrText xml:space="preserve"> PAGEREF _Toc244027128 \h </w:instrText>
+              <w:instrText xml:space="preserve"> PAGEREF _Toc244027728 \h </w:instrText>
             </w:r>
             <w:r>
               <w:rPr>
@@ -856,7 +856,7 @@
               <w14:ligatures w14:val="standardContextual"/>
             </w:rPr>
           </w:pPr>
-          <w:hyperlink w:anchor="_Toc244027129" w:history="1">
+          <w:hyperlink w:anchor="_Toc244027729" w:history="1">
             <w:r>
               <w:rPr>
                 <w:rStyle w:val="Hipervnculo"/>
@@ -880,7 +880,7 @@
               <w:rPr>
                 <w:noProof/>
               </w:rPr>
-              <w:instrText xml:space="preserve"> PAGEREF _Toc244027129 \h </w:instrText>
+              <w:instrText xml:space="preserve"> PAGEREF _Toc244027729 \h </w:instrText>
             </w:r>
             <w:r>
               <w:rPr>
@@ -920,7 +920,7 @@
               <w14:ligatures w14:val="standardContextual"/>
             </w:rPr>
           </w:pPr>
-          <w:hyperlink w:anchor="_Toc244027130" w:history="1">
+          <w:hyperlink w:anchor="_Toc244027730" w:history="1">
             <w:r>
               <w:rPr>
                 <w:rStyle w:val="Hipervnculo"/>
@@ -944,7 +944,7 @@
               <w:rPr>
                 <w:noProof/>
               </w:rPr>
-              <w:instrText xml:space="preserve"> PAGEREF _Toc244027130 \h </w:instrText>
+              <w:instrText xml:space="preserve"> PAGEREF _Toc244027730 \h </w:instrText>
             </w:r>
             <w:r>
               <w:rPr>
@@ -984,7 +984,7 @@
               <w14:ligatures w14:val="standardContextual"/>
             </w:rPr>
           </w:pPr>
-          <w:hyperlink w:anchor="_Toc244027131" w:history="1">
+          <w:hyperlink w:anchor="_Toc244027731" w:history="1">
             <w:r>
               <w:rPr>
                 <w:rStyle w:val="Hipervnculo"/>
@@ -1008,7 +1008,7 @@
               <w:rPr>
                 <w:noProof/>
               </w:rPr>
-              <w:instrText xml:space="preserve"> PAGEREF _Toc244027131 \h </w:instrText>
+              <w:instrText xml:space="preserve"> PAGEREF _Toc244027731 \h </w:instrText>
             </w:r>
             <w:r>
               <w:rPr>
@@ -1048,7 +1048,7 @@
               <w14:ligatures w14:val="standardContextual"/>
             </w:rPr>
           </w:pPr>
-          <w:hyperlink w:anchor="_Toc244027132" w:history="1">
+          <w:hyperlink w:anchor="_Toc244027732" w:history="1">
             <w:r>
               <w:rPr>
                 <w:rStyle w:val="Hipervnculo"/>
@@ -1072,7 +1072,7 @@
               <w:rPr>
                 <w:noProof/>
               </w:rPr>
-              <w:instrText xml:space="preserve"> PAGEREF _Toc244027132 \h </w:instrText>
+              <w:instrText xml:space="preserve"> PAGEREF _Toc244027732 \h </w:instrText>
             </w:r>
             <w:r>
               <w:rPr>
@@ -1112,7 +1112,7 @@
               <w14:ligatures w14:val="standardContextual"/>
             </w:rPr>
           </w:pPr>
-          <w:hyperlink w:anchor="_Toc244027133" w:history="1">
+          <w:hyperlink w:anchor="_Toc244027733" w:history="1">
             <w:r>
               <w:rPr>
                 <w:rStyle w:val="Hipervnculo"/>
@@ -1136,7 +1136,7 @@
               <w:rPr>
                 <w:noProof/>
               </w:rPr>
-              <w:instrText xml:space="preserve"> PAGEREF _Toc244027133 \h </w:instrText>
+              <w:instrText xml:space="preserve"> PAGEREF _Toc244027733 \h </w:instrText>
             </w:r>
             <w:r>
               <w:rPr>
@@ -1176,7 +1176,7 @@
               <w14:ligatures w14:val="standardContextual"/>
             </w:rPr>
           </w:pPr>
-          <w:hyperlink w:anchor="_Toc244027134" w:history="1">
+          <w:hyperlink w:anchor="_Toc244027734" w:history="1">
             <w:r>
               <w:rPr>
                 <w:rStyle w:val="Hipervnculo"/>
@@ -1200,7 +1200,7 @@
               <w:rPr>
                 <w:noProof/>
               </w:rPr>
-              <w:instrText xml:space="preserve"> PAGEREF _Toc244027134 \h </w:instrText>
+              <w:instrText xml:space="preserve"> PAGEREF _Toc244027734 \h </w:instrText>
             </w:r>
             <w:r>
               <w:rPr>
@@ -1240,7 +1240,7 @@
               <w14:ligatures w14:val="standardContextual"/>
             </w:rPr>
           </w:pPr>
-          <w:hyperlink w:anchor="_Toc244027135" w:history="1">
+          <w:hyperlink w:anchor="_Toc244027735" w:history="1">
             <w:r>
               <w:rPr>
                 <w:rStyle w:val="Hipervnculo"/>
@@ -1264,7 +1264,7 @@
               <w:rPr>
                 <w:noProof/>
               </w:rPr>
-              <w:instrText xml:space="preserve"> PAGEREF _Toc244027135 \h </w:instrText>
+              <w:instrText xml:space="preserve"> PAGEREF _Toc244027735 \h </w:instrText>
             </w:r>
             <w:r>
               <w:rPr>
@@ -1304,7 +1304,7 @@
               <w14:ligatures w14:val="standardContextual"/>
             </w:rPr>
           </w:pPr>
-          <w:hyperlink w:anchor="_Toc244027136" w:history="1">
+          <w:hyperlink w:anchor="_Toc244027736" w:history="1">
             <w:r>
               <w:rPr>
                 <w:rStyle w:val="Hipervnculo"/>
@@ -1328,7 +1328,7 @@
               <w:rPr>
                 <w:noProof/>
               </w:rPr>
-              <w:instrText xml:space="preserve"> PAGEREF _Toc244027136 \h </w:instrText>
+              <w:instrText xml:space="preserve"> PAGEREF _Toc244027736 \h </w:instrText>
             </w:r>
             <w:r>
               <w:rPr>
@@ -1368,7 +1368,7 @@
               <w14:ligatures w14:val="standardContextual"/>
             </w:rPr>
           </w:pPr>
-          <w:hyperlink w:anchor="_Toc244027137" w:history="1">
+          <w:hyperlink w:anchor="_Toc244027737" w:history="1">
             <w:r>
               <w:rPr>
                 <w:rStyle w:val="Hipervnculo"/>
@@ -1392,7 +1392,7 @@
               <w:rPr>
                 <w:noProof/>
               </w:rPr>
-              <w:instrText xml:space="preserve"> PAGEREF _Toc244027137 \h </w:instrText>
+              <w:instrText xml:space="preserve"> PAGEREF _Toc244027737 \h </w:instrText>
             </w:r>
             <w:r>
               <w:rPr>
@@ -1432,7 +1432,7 @@
               <w14:ligatures w14:val="standardContextual"/>
             </w:rPr>
           </w:pPr>
-          <w:hyperlink w:anchor="_Toc244027138" w:history="1">
+          <w:hyperlink w:anchor="_Toc244027738" w:history="1">
             <w:r>
               <w:rPr>
                 <w:rStyle w:val="Hipervnculo"/>
@@ -1456,7 +1456,7 @@
               <w:rPr>
                 <w:noProof/>
               </w:rPr>
-              <w:instrText xml:space="preserve"> PAGEREF _Toc244027138 \h </w:instrText>
+              <w:instrText xml:space="preserve"> PAGEREF _Toc244027738 \h </w:instrText>
             </w:r>
             <w:r>
               <w:rPr>
@@ -1500,7 +1500,7 @@
         <w:pStyle w:val="Ttulo1"/>
         <w:keepNext/>
       </w:pPr>
-      <w:bookmarkStart w:id="0" w:name="_Toc244027120"/>
+      <w:bookmarkStart w:id="0" w:name="_Toc244027720"/>
       <w:r>
         <w:lastRenderedPageBreak/>
         <w:t>1. Antes de empezar</w:t>
@@ -1520,7 +1520,7 @@
         <w:pStyle w:val="Ttulo2"/>
         <w:keepNext/>
       </w:pPr>
-      <w:bookmarkStart w:id="1" w:name="_Toc244027121"/>
+      <w:bookmarkStart w:id="1" w:name="_Toc244027721"/>
       <w:r>
         <w:t>1.1 Qué vamos a probar y por qué</w:t>
       </w:r>
@@ -1914,7 +1914,7 @@
         <w:pStyle w:val="Ttulo2"/>
         <w:keepNext/>
       </w:pPr>
-      <w:bookmarkStart w:id="2" w:name="_Toc244027122"/>
+      <w:bookmarkStart w:id="2" w:name="_Toc244027722"/>
       <w:r>
         <w:t>1.2 El recorrido completo</w:t>
       </w:r>
@@ -2899,7 +2899,7 @@
         <w:pStyle w:val="Ttulo2"/>
         <w:keepNext/>
       </w:pPr>
-      <w:bookmarkStart w:id="3" w:name="_Toc244027123"/>
+      <w:bookmarkStart w:id="3" w:name="_Toc244027723"/>
       <w:r>
         <w:t>1.3 Qué necesitas</w:t>
       </w:r>
@@ -2978,7 +2978,7 @@
         <w:pStyle w:val="Ttulo1"/>
         <w:keepNext/>
       </w:pPr>
-      <w:bookmarkStart w:id="4" w:name="_Toc244027124"/>
+      <w:bookmarkStart w:id="4" w:name="_Toc244027724"/>
       <w:r>
         <w:t>2. Paso 1: instalar k6</w:t>
       </w:r>
@@ -3097,7 +3097,7 @@
           <w:noProof/>
         </w:rPr>
         <w:drawing>
-          <wp:inline distT="0" distB="0" distL="0" distR="0" wp14:anchorId="01DE0C04" wp14:editId="3E7FB4BB">
+          <wp:inline distT="0" distB="0" distL="0" distR="0" wp14:anchorId="49AC60BB" wp14:editId="7507AFCF">
             <wp:extent cx="5400675" cy="495300"/>
             <wp:effectExtent l="0" t="0" r="0" b="0"/>
             <wp:docPr id="2" name="Imagen 2"/>
@@ -3156,7 +3156,7 @@
         <w:pStyle w:val="Ttulo1"/>
         <w:keepNext/>
       </w:pPr>
-      <w:bookmarkStart w:id="5" w:name="_Toc244027125"/>
+      <w:bookmarkStart w:id="5" w:name="_Toc244027725"/>
       <w:r>
         <w:t>3. Paso 2: levantar la base de datos</w:t>
       </w:r>
@@ -3237,7 +3237,7 @@
         <w:pStyle w:val="Ttulo1"/>
         <w:keepNext/>
       </w:pPr>
-      <w:bookmarkStart w:id="6" w:name="_Toc244027126"/>
+      <w:bookmarkStart w:id="6" w:name="_Toc244027726"/>
       <w:r>
         <w:t>4. Paso 3: crear las tablas y cargar datos de prueba</w:t>
       </w:r>
@@ -3365,7 +3365,7 @@
         <w:pStyle w:val="Ttulo1"/>
         <w:keepNext/>
       </w:pPr>
-      <w:bookmarkStart w:id="7" w:name="_Toc244027127"/>
+      <w:bookmarkStart w:id="7" w:name="_Toc244027727"/>
       <w:r>
         <w:t>5. Paso 4: crear los usuarios de prueba</w:t>
       </w:r>
@@ -3519,7 +3519,7 @@
         <w:pStyle w:val="Ttulo1"/>
         <w:keepNext/>
       </w:pPr>
-      <w:bookmarkStart w:id="8" w:name="_Toc244027128"/>
+      <w:bookmarkStart w:id="8" w:name="_Toc244027728"/>
       <w:r>
         <w:t>6. Paso 5: ajustar los límites de peticiones</w:t>
       </w:r>
@@ -3674,7 +3674,7 @@
         <w:pStyle w:val="Ttulo1"/>
         <w:keepNext/>
       </w:pPr>
-      <w:bookmarkStart w:id="9" w:name="_Toc244027129"/>
+      <w:bookmarkStart w:id="9" w:name="_Toc244027729"/>
       <w:r>
         <w:lastRenderedPageBreak/>
         <w:t>7. Paso 6: levantar la API</w:t>
@@ -3774,7 +3774,7 @@
         <w:pStyle w:val="Ttulo1"/>
         <w:keepNext/>
       </w:pPr>
-      <w:bookmarkStart w:id="10" w:name="_Toc244027130"/>
+      <w:bookmarkStart w:id="10" w:name="_Toc244027730"/>
       <w:r>
         <w:t>8. Paso 7: comprobar que la API está sana</w:t>
       </w:r>
@@ -3861,7 +3861,7 @@
           <w:noProof/>
         </w:rPr>
         <w:drawing>
-          <wp:inline distT="0" distB="0" distL="0" distR="0" wp14:anchorId="44453FC4" wp14:editId="2FAC227D">
+          <wp:inline distT="0" distB="0" distL="0" distR="0" wp14:anchorId="42F09C26" wp14:editId="23A332B3">
             <wp:extent cx="5400675" cy="590550"/>
             <wp:effectExtent l="0" t="0" r="0" b="0"/>
             <wp:docPr id="3" name="Imagen 3"/>
@@ -3920,7 +3920,7 @@
         <w:pStyle w:val="Ttulo1"/>
         <w:keepNext/>
       </w:pPr>
-      <w:bookmarkStart w:id="11" w:name="_Toc244027131"/>
+      <w:bookmarkStart w:id="11" w:name="_Toc244027731"/>
       <w:r>
         <w:t>9. Paso 8: prueba de humo (smoke)</w:t>
       </w:r>
@@ -4420,7 +4420,7 @@
           <w:noProof/>
         </w:rPr>
         <w:drawing>
-          <wp:inline distT="0" distB="0" distL="0" distR="0" wp14:anchorId="79B3D88B" wp14:editId="0387431D">
+          <wp:inline distT="0" distB="0" distL="0" distR="0" wp14:anchorId="46DCCF26" wp14:editId="2003C1A5">
             <wp:extent cx="5400675" cy="5619750"/>
             <wp:effectExtent l="0" t="0" r="0" b="0"/>
             <wp:docPr id="4" name="Imagen 4"/>
@@ -4479,7 +4479,7 @@
         <w:pStyle w:val="Ttulo1"/>
         <w:keepNext/>
       </w:pPr>
-      <w:bookmarkStart w:id="12" w:name="_Toc244027132"/>
+      <w:bookmarkStart w:id="12" w:name="_Toc244027732"/>
       <w:r>
         <w:lastRenderedPageBreak/>
         <w:t>10. Paso 9: prueba del límite de login</w:t>
@@ -4491,7 +4491,7 @@
         <w:spacing w:after="120" w:line="300" w:lineRule="auto"/>
       </w:pPr>
       <w:r>
-        <w:t>Esta prueba necesita el límite real de login. En una tercera terminal, dentro de la carpeta api, levanta una segunda API en el puerto 8001 con el límite de 5 intentos:</w:t>
+        <w:t>Esta prueba necesita el límite real de login. Abre una tercera ventana de PowerShell (Terminal 3), entra a la carpeta api y levanta una segunda API en el puerto 8001 con el límite de 5 intentos. La Terminal 1 sigue encendida con la API del puerto 8000; no la cierres.</w:t>
       </w:r>
     </w:p>
     <w:p>
@@ -4524,6 +4524,23 @@
           <w:sz w:val="19"/>
           <w:szCs w:val="19"/>
         </w:rPr>
+        <w:t>cd C:\Proyectos\LeGrandHotel\api</w:t>
+      </w:r>
+    </w:p>
+    <w:p>
+      <w:pPr>
+        <w:keepNext/>
+        <w:keepLines/>
+        <w:shd w:val="clear" w:color="auto" w:fill="F2F2F2"/>
+        <w:spacing w:line="250" w:lineRule="auto"/>
+        <w:ind w:left="200"/>
+      </w:pPr>
+      <w:r>
+        <w:rPr>
+          <w:rFonts w:ascii="Consolas" w:eastAsia="Consolas" w:hAnsi="Consolas" w:cs="Consolas"/>
+          <w:sz w:val="19"/>
+          <w:szCs w:val="19"/>
+        </w:rPr>
         <w:t>$env:RATE_LIMIT_LOGIN="5"</w:t>
       </w:r>
     </w:p>
@@ -4573,6 +4590,23 @@
           <w:sz w:val="19"/>
           <w:szCs w:val="19"/>
         </w:rPr>
+        <w:t>cd C:\Proyectos\LeGrandHotel\api</w:t>
+      </w:r>
+    </w:p>
+    <w:p>
+      <w:pPr>
+        <w:keepNext/>
+        <w:keepLines/>
+        <w:shd w:val="clear" w:color="auto" w:fill="F2F2F2"/>
+        <w:spacing w:line="250" w:lineRule="auto"/>
+        <w:ind w:left="200"/>
+      </w:pPr>
+      <w:r>
+        <w:rPr>
+          <w:rFonts w:ascii="Consolas" w:eastAsia="Consolas" w:hAnsi="Consolas" w:cs="Consolas"/>
+          <w:sz w:val="19"/>
+          <w:szCs w:val="19"/>
+        </w:rPr>
         <w:t>set "RATE_LIMIT_LOGIN=5"</w:t>
       </w:r>
     </w:p>
@@ -4597,7 +4631,7 @@
         <w:spacing w:after="120" w:line="300" w:lineRule="auto"/>
       </w:pPr>
       <w:r>
-        <w:t>Y en la terminal de k6:</w:t>
+        <w:t>Debe decir «Development Server (http://127.0.0.1:8001) started». Ahora vuelve a la Terminal 2 (la de k6, en la carpeta del proyecto) y corre:</w:t>
       </w:r>
     </w:p>
     <w:p>
@@ -4674,7 +4708,7 @@
         </w:rPr>
         <w:lastRenderedPageBreak/>
         <w:drawing>
-          <wp:inline distT="0" distB="0" distL="0" distR="0" wp14:anchorId="77265153" wp14:editId="140ADA49">
+          <wp:inline distT="0" distB="0" distL="0" distR="0" wp14:anchorId="4B288C71" wp14:editId="6DA0990C">
             <wp:extent cx="5400675" cy="4524375"/>
             <wp:effectExtent l="0" t="0" r="0" b="0"/>
             <wp:docPr id="5" name="Imagen 5"/>
@@ -4733,7 +4767,7 @@
         <w:pStyle w:val="Ttulo1"/>
         <w:keepNext/>
       </w:pPr>
-      <w:bookmarkStart w:id="13" w:name="_Toc244027133"/>
+      <w:bookmarkStart w:id="13" w:name="_Toc244027733"/>
       <w:r>
         <w:t>11. Paso 10: pruebas de carga por escalones</w:t>
       </w:r>
@@ -5378,7 +5412,7 @@
         </w:rPr>
         <w:lastRenderedPageBreak/>
         <w:drawing>
-          <wp:inline distT="0" distB="0" distL="0" distR="0" wp14:anchorId="7F64E32E" wp14:editId="5C6C528C">
+          <wp:inline distT="0" distB="0" distL="0" distR="0" wp14:anchorId="451C64EF" wp14:editId="6D58FD2A">
             <wp:extent cx="5400675" cy="6343650"/>
             <wp:effectExtent l="0" t="0" r="0" b="0"/>
             <wp:docPr id="6" name="Imagen 6"/>
@@ -5452,7 +5486,7 @@
         </w:rPr>
         <w:lastRenderedPageBreak/>
         <w:drawing>
-          <wp:inline distT="0" distB="0" distL="0" distR="0" wp14:anchorId="42A7A1FF" wp14:editId="33FE8503">
+          <wp:inline distT="0" distB="0" distL="0" distR="0" wp14:anchorId="09F51405" wp14:editId="1A0DBCB1">
             <wp:extent cx="5038725" cy="3600450"/>
             <wp:effectExtent l="0" t="0" r="0" b="0"/>
             <wp:docPr id="7" name="Imagen 7"/>
@@ -5511,7 +5545,7 @@
         <w:pStyle w:val="Ttulo1"/>
         <w:keepNext/>
       </w:pPr>
-      <w:bookmarkStart w:id="14" w:name="_Toc244027134"/>
+      <w:bookmarkStart w:id="14" w:name="_Toc244027734"/>
       <w:r>
         <w:t>12. Paso 11: leer los resultados</w:t>
       </w:r>
@@ -6388,7 +6422,7 @@
         <w:pStyle w:val="Ttulo2"/>
         <w:keepNext/>
       </w:pPr>
-      <w:bookmarkStart w:id="15" w:name="_Toc244027135"/>
+      <w:bookmarkStart w:id="15" w:name="_Toc244027735"/>
       <w:r>
         <w:lastRenderedPageBreak/>
         <w:t>12.1 Qué salió en nuestras pruebas</w:t>
@@ -7010,7 +7044,7 @@
         <w:pStyle w:val="Ttulo1"/>
         <w:keepNext/>
       </w:pPr>
-      <w:bookmarkStart w:id="16" w:name="_Toc244027136"/>
+      <w:bookmarkStart w:id="16" w:name="_Toc244027736"/>
       <w:r>
         <w:t>13. Paso 12: limpiar y dejar todo como estaba</w:t>
       </w:r>
@@ -7256,7 +7290,7 @@
         <w:pStyle w:val="Ttulo1"/>
         <w:keepNext/>
       </w:pPr>
-      <w:bookmarkStart w:id="17" w:name="_Toc244027137"/>
+      <w:bookmarkStart w:id="17" w:name="_Toc244027737"/>
       <w:r>
         <w:t>14. Si algo sale mal</w:t>
       </w:r>
@@ -8156,7 +8190,7 @@
         <w:pStyle w:val="Ttulo1"/>
         <w:keepNext/>
       </w:pPr>
-      <w:bookmarkStart w:id="18" w:name="_Toc244027138"/>
+      <w:bookmarkStart w:id="18" w:name="_Toc244027738"/>
       <w:r>
         <w:t>15. Resumen de comandos</w:t>
       </w:r>
@@ -8167,6 +8201,505 @@
         <w:spacing w:after="120" w:line="300" w:lineRule="auto"/>
       </w:pPr>
       <w:r>
+        <w:t>Se usan tres ventanas de PowerShell. Fíjate en qué carpeta está cada una: lo dice el inicio de la línea (PS C:\Proyectos\LeGrandHotel&gt; o PS C:\Proyectos\LeGrandHotel\api&gt;).</w:t>
+      </w:r>
+    </w:p>
+    <w:tbl>
+      <w:tblPr>
+        <w:tblW w:w="9070" w:type="dxa"/>
+        <w:tblBorders>
+          <w:top w:val="single" w:sz="4" w:space="0" w:color="auto"/>
+          <w:left w:val="single" w:sz="4" w:space="0" w:color="auto"/>
+          <w:bottom w:val="single" w:sz="4" w:space="0" w:color="auto"/>
+          <w:right w:val="single" w:sz="4" w:space="0" w:color="auto"/>
+          <w:insideH w:val="single" w:sz="4" w:space="0" w:color="auto"/>
+          <w:insideV w:val="single" w:sz="4" w:space="0" w:color="auto"/>
+        </w:tblBorders>
+        <w:tblLook w:val="04A0" w:firstRow="1" w:lastRow="0" w:firstColumn="1" w:lastColumn="0" w:noHBand="0" w:noVBand="1"/>
+      </w:tblPr>
+      <w:tblGrid>
+        <w:gridCol w:w="1458"/>
+        <w:gridCol w:w="2915"/>
+        <w:gridCol w:w="2753"/>
+        <w:gridCol w:w="1944"/>
+      </w:tblGrid>
+      <w:tr>
+        <w:trPr>
+          <w:tblHeader/>
+        </w:trPr>
+        <w:tc>
+          <w:tcPr>
+            <w:tcW w:w="1458" w:type="dxa"/>
+            <w:tcBorders>
+              <w:top w:val="single" w:sz="4" w:space="0" w:color="000000"/>
+              <w:left w:val="single" w:sz="4" w:space="0" w:color="000000"/>
+              <w:bottom w:val="single" w:sz="4" w:space="0" w:color="000000"/>
+              <w:right w:val="single" w:sz="4" w:space="0" w:color="000000"/>
+            </w:tcBorders>
+            <w:shd w:val="clear" w:color="auto" w:fill="D9D9D9"/>
+            <w:tcMar>
+              <w:top w:w="60" w:type="dxa"/>
+              <w:left w:w="90" w:type="dxa"/>
+              <w:bottom w:w="60" w:type="dxa"/>
+              <w:right w:w="90" w:type="dxa"/>
+            </w:tcMar>
+            <w:vAlign w:val="center"/>
+          </w:tcPr>
+          <w:p>
+            <w:r>
+              <w:rPr>
+                <w:b/>
+                <w:bCs/>
+                <w:sz w:val="20"/>
+                <w:szCs w:val="20"/>
+              </w:rPr>
+              <w:t>Ventana</w:t>
+            </w:r>
+          </w:p>
+        </w:tc>
+        <w:tc>
+          <w:tcPr>
+            <w:tcW w:w="2915" w:type="dxa"/>
+            <w:tcBorders>
+              <w:top w:val="single" w:sz="4" w:space="0" w:color="000000"/>
+              <w:left w:val="single" w:sz="4" w:space="0" w:color="000000"/>
+              <w:bottom w:val="single" w:sz="4" w:space="0" w:color="000000"/>
+              <w:right w:val="single" w:sz="4" w:space="0" w:color="000000"/>
+            </w:tcBorders>
+            <w:shd w:val="clear" w:color="auto" w:fill="D9D9D9"/>
+            <w:tcMar>
+              <w:top w:w="60" w:type="dxa"/>
+              <w:left w:w="90" w:type="dxa"/>
+              <w:bottom w:w="60" w:type="dxa"/>
+              <w:right w:w="90" w:type="dxa"/>
+            </w:tcMar>
+            <w:vAlign w:val="center"/>
+          </w:tcPr>
+          <w:p>
+            <w:r>
+              <w:rPr>
+                <w:b/>
+                <w:bCs/>
+                <w:sz w:val="20"/>
+                <w:szCs w:val="20"/>
+              </w:rPr>
+              <w:t>Carpeta</w:t>
+            </w:r>
+          </w:p>
+        </w:tc>
+        <w:tc>
+          <w:tcPr>
+            <w:tcW w:w="2753" w:type="dxa"/>
+            <w:tcBorders>
+              <w:top w:val="single" w:sz="4" w:space="0" w:color="000000"/>
+              <w:left w:val="single" w:sz="4" w:space="0" w:color="000000"/>
+              <w:bottom w:val="single" w:sz="4" w:space="0" w:color="000000"/>
+              <w:right w:val="single" w:sz="4" w:space="0" w:color="000000"/>
+            </w:tcBorders>
+            <w:shd w:val="clear" w:color="auto" w:fill="D9D9D9"/>
+            <w:tcMar>
+              <w:top w:w="60" w:type="dxa"/>
+              <w:left w:w="90" w:type="dxa"/>
+              <w:bottom w:w="60" w:type="dxa"/>
+              <w:right w:w="90" w:type="dxa"/>
+            </w:tcMar>
+            <w:vAlign w:val="center"/>
+          </w:tcPr>
+          <w:p>
+            <w:r>
+              <w:rPr>
+                <w:b/>
+                <w:bCs/>
+                <w:sz w:val="20"/>
+                <w:szCs w:val="20"/>
+              </w:rPr>
+              <w:t>Para qué</w:t>
+            </w:r>
+          </w:p>
+        </w:tc>
+        <w:tc>
+          <w:tcPr>
+            <w:tcW w:w="1944" w:type="dxa"/>
+            <w:tcBorders>
+              <w:top w:val="single" w:sz="4" w:space="0" w:color="000000"/>
+              <w:left w:val="single" w:sz="4" w:space="0" w:color="000000"/>
+              <w:bottom w:val="single" w:sz="4" w:space="0" w:color="000000"/>
+              <w:right w:val="single" w:sz="4" w:space="0" w:color="000000"/>
+            </w:tcBorders>
+            <w:shd w:val="clear" w:color="auto" w:fill="D9D9D9"/>
+            <w:tcMar>
+              <w:top w:w="60" w:type="dxa"/>
+              <w:left w:w="90" w:type="dxa"/>
+              <w:bottom w:w="60" w:type="dxa"/>
+              <w:right w:w="90" w:type="dxa"/>
+            </w:tcMar>
+            <w:vAlign w:val="center"/>
+          </w:tcPr>
+          <w:p>
+            <w:r>
+              <w:rPr>
+                <w:b/>
+                <w:bCs/>
+                <w:sz w:val="20"/>
+                <w:szCs w:val="20"/>
+              </w:rPr>
+              <w:t>Cuándo</w:t>
+            </w:r>
+          </w:p>
+        </w:tc>
+      </w:tr>
+      <w:tr>
+        <w:trPr>
+          <w:cantSplit/>
+        </w:trPr>
+        <w:tc>
+          <w:tcPr>
+            <w:tcW w:w="1458" w:type="dxa"/>
+            <w:tcBorders>
+              <w:top w:val="single" w:sz="4" w:space="0" w:color="000000"/>
+              <w:left w:val="single" w:sz="4" w:space="0" w:color="000000"/>
+              <w:bottom w:val="single" w:sz="4" w:space="0" w:color="000000"/>
+              <w:right w:val="single" w:sz="4" w:space="0" w:color="000000"/>
+            </w:tcBorders>
+            <w:tcMar>
+              <w:top w:w="60" w:type="dxa"/>
+              <w:left w:w="90" w:type="dxa"/>
+              <w:bottom w:w="60" w:type="dxa"/>
+              <w:right w:w="90" w:type="dxa"/>
+            </w:tcMar>
+            <w:vAlign w:val="center"/>
+          </w:tcPr>
+          <w:p>
+            <w:r>
+              <w:rPr>
+                <w:sz w:val="20"/>
+                <w:szCs w:val="20"/>
+              </w:rPr>
+              <w:t>Terminal 1</w:t>
+            </w:r>
+          </w:p>
+        </w:tc>
+        <w:tc>
+          <w:tcPr>
+            <w:tcW w:w="2915" w:type="dxa"/>
+            <w:tcBorders>
+              <w:top w:val="single" w:sz="4" w:space="0" w:color="000000"/>
+              <w:left w:val="single" w:sz="4" w:space="0" w:color="000000"/>
+              <w:bottom w:val="single" w:sz="4" w:space="0" w:color="000000"/>
+              <w:right w:val="single" w:sz="4" w:space="0" w:color="000000"/>
+            </w:tcBorders>
+            <w:tcMar>
+              <w:top w:w="60" w:type="dxa"/>
+              <w:left w:w="90" w:type="dxa"/>
+              <w:bottom w:w="60" w:type="dxa"/>
+              <w:right w:w="90" w:type="dxa"/>
+            </w:tcMar>
+            <w:vAlign w:val="center"/>
+          </w:tcPr>
+          <w:p>
+            <w:r>
+              <w:rPr>
+                <w:sz w:val="20"/>
+                <w:szCs w:val="20"/>
+              </w:rPr>
+              <w:t>C:\Proyectos\LeGrandHotel y luego ...\api</w:t>
+            </w:r>
+          </w:p>
+        </w:tc>
+        <w:tc>
+          <w:tcPr>
+            <w:tcW w:w="2753" w:type="dxa"/>
+            <w:tcBorders>
+              <w:top w:val="single" w:sz="4" w:space="0" w:color="000000"/>
+              <w:left w:val="single" w:sz="4" w:space="0" w:color="000000"/>
+              <w:bottom w:val="single" w:sz="4" w:space="0" w:color="000000"/>
+              <w:right w:val="single" w:sz="4" w:space="0" w:color="000000"/>
+            </w:tcBorders>
+            <w:tcMar>
+              <w:top w:w="60" w:type="dxa"/>
+              <w:left w:w="90" w:type="dxa"/>
+              <w:bottom w:w="60" w:type="dxa"/>
+              <w:right w:w="90" w:type="dxa"/>
+            </w:tcMar>
+            <w:vAlign w:val="center"/>
+          </w:tcPr>
+          <w:p>
+            <w:r>
+              <w:rPr>
+                <w:sz w:val="20"/>
+                <w:szCs w:val="20"/>
+              </w:rPr>
+              <w:t>Docker, datos y la API del puerto 8000</w:t>
+            </w:r>
+          </w:p>
+        </w:tc>
+        <w:tc>
+          <w:tcPr>
+            <w:tcW w:w="1944" w:type="dxa"/>
+            <w:tcBorders>
+              <w:top w:val="single" w:sz="4" w:space="0" w:color="000000"/>
+              <w:left w:val="single" w:sz="4" w:space="0" w:color="000000"/>
+              <w:bottom w:val="single" w:sz="4" w:space="0" w:color="000000"/>
+              <w:right w:val="single" w:sz="4" w:space="0" w:color="000000"/>
+            </w:tcBorders>
+            <w:tcMar>
+              <w:top w:w="60" w:type="dxa"/>
+              <w:left w:w="90" w:type="dxa"/>
+              <w:bottom w:w="60" w:type="dxa"/>
+              <w:right w:w="90" w:type="dxa"/>
+            </w:tcMar>
+            <w:vAlign w:val="center"/>
+          </w:tcPr>
+          <w:p>
+            <w:r>
+              <w:rPr>
+                <w:sz w:val="20"/>
+                <w:szCs w:val="20"/>
+              </w:rPr>
+              <w:t>Desde el inicio hasta el final</w:t>
+            </w:r>
+          </w:p>
+        </w:tc>
+      </w:tr>
+      <w:tr>
+        <w:trPr>
+          <w:cantSplit/>
+        </w:trPr>
+        <w:tc>
+          <w:tcPr>
+            <w:tcW w:w="1458" w:type="dxa"/>
+            <w:tcBorders>
+              <w:top w:val="single" w:sz="4" w:space="0" w:color="000000"/>
+              <w:left w:val="single" w:sz="4" w:space="0" w:color="000000"/>
+              <w:bottom w:val="single" w:sz="4" w:space="0" w:color="000000"/>
+              <w:right w:val="single" w:sz="4" w:space="0" w:color="000000"/>
+            </w:tcBorders>
+            <w:tcMar>
+              <w:top w:w="60" w:type="dxa"/>
+              <w:left w:w="90" w:type="dxa"/>
+              <w:bottom w:w="60" w:type="dxa"/>
+              <w:right w:w="90" w:type="dxa"/>
+            </w:tcMar>
+            <w:vAlign w:val="center"/>
+          </w:tcPr>
+          <w:p>
+            <w:r>
+              <w:rPr>
+                <w:sz w:val="20"/>
+                <w:szCs w:val="20"/>
+              </w:rPr>
+              <w:t>Terminal 2</w:t>
+            </w:r>
+          </w:p>
+        </w:tc>
+        <w:tc>
+          <w:tcPr>
+            <w:tcW w:w="2915" w:type="dxa"/>
+            <w:tcBorders>
+              <w:top w:val="single" w:sz="4" w:space="0" w:color="000000"/>
+              <w:left w:val="single" w:sz="4" w:space="0" w:color="000000"/>
+              <w:bottom w:val="single" w:sz="4" w:space="0" w:color="000000"/>
+              <w:right w:val="single" w:sz="4" w:space="0" w:color="000000"/>
+            </w:tcBorders>
+            <w:tcMar>
+              <w:top w:w="60" w:type="dxa"/>
+              <w:left w:w="90" w:type="dxa"/>
+              <w:bottom w:w="60" w:type="dxa"/>
+              <w:right w:w="90" w:type="dxa"/>
+            </w:tcMar>
+            <w:vAlign w:val="center"/>
+          </w:tcPr>
+          <w:p>
+            <w:r>
+              <w:rPr>
+                <w:sz w:val="20"/>
+                <w:szCs w:val="20"/>
+              </w:rPr>
+              <w:t>C:\Proyectos\LeGrandHotel</w:t>
+            </w:r>
+          </w:p>
+        </w:tc>
+        <w:tc>
+          <w:tcPr>
+            <w:tcW w:w="2753" w:type="dxa"/>
+            <w:tcBorders>
+              <w:top w:val="single" w:sz="4" w:space="0" w:color="000000"/>
+              <w:left w:val="single" w:sz="4" w:space="0" w:color="000000"/>
+              <w:bottom w:val="single" w:sz="4" w:space="0" w:color="000000"/>
+              <w:right w:val="single" w:sz="4" w:space="0" w:color="000000"/>
+            </w:tcBorders>
+            <w:tcMar>
+              <w:top w:w="60" w:type="dxa"/>
+              <w:left w:w="90" w:type="dxa"/>
+              <w:bottom w:w="60" w:type="dxa"/>
+              <w:right w:w="90" w:type="dxa"/>
+            </w:tcMar>
+            <w:vAlign w:val="center"/>
+          </w:tcPr>
+          <w:p>
+            <w:r>
+              <w:rPr>
+                <w:sz w:val="20"/>
+                <w:szCs w:val="20"/>
+              </w:rPr>
+              <w:t>Todos los comandos curl.exe y k6 run</w:t>
+            </w:r>
+          </w:p>
+        </w:tc>
+        <w:tc>
+          <w:tcPr>
+            <w:tcW w:w="1944" w:type="dxa"/>
+            <w:tcBorders>
+              <w:top w:val="single" w:sz="4" w:space="0" w:color="000000"/>
+              <w:left w:val="single" w:sz="4" w:space="0" w:color="000000"/>
+              <w:bottom w:val="single" w:sz="4" w:space="0" w:color="000000"/>
+              <w:right w:val="single" w:sz="4" w:space="0" w:color="000000"/>
+            </w:tcBorders>
+            <w:tcMar>
+              <w:top w:w="60" w:type="dxa"/>
+              <w:left w:w="90" w:type="dxa"/>
+              <w:bottom w:w="60" w:type="dxa"/>
+              <w:right w:w="90" w:type="dxa"/>
+            </w:tcMar>
+            <w:vAlign w:val="center"/>
+          </w:tcPr>
+          <w:p>
+            <w:r>
+              <w:rPr>
+                <w:sz w:val="20"/>
+                <w:szCs w:val="20"/>
+              </w:rPr>
+              <w:t>Desde el paso 7</w:t>
+            </w:r>
+          </w:p>
+        </w:tc>
+      </w:tr>
+      <w:tr>
+        <w:trPr>
+          <w:cantSplit/>
+        </w:trPr>
+        <w:tc>
+          <w:tcPr>
+            <w:tcW w:w="1458" w:type="dxa"/>
+            <w:tcBorders>
+              <w:top w:val="single" w:sz="4" w:space="0" w:color="000000"/>
+              <w:left w:val="single" w:sz="4" w:space="0" w:color="000000"/>
+              <w:bottom w:val="single" w:sz="4" w:space="0" w:color="000000"/>
+              <w:right w:val="single" w:sz="4" w:space="0" w:color="000000"/>
+            </w:tcBorders>
+            <w:tcMar>
+              <w:top w:w="60" w:type="dxa"/>
+              <w:left w:w="90" w:type="dxa"/>
+              <w:bottom w:w="60" w:type="dxa"/>
+              <w:right w:w="90" w:type="dxa"/>
+            </w:tcMar>
+            <w:vAlign w:val="center"/>
+          </w:tcPr>
+          <w:p>
+            <w:r>
+              <w:rPr>
+                <w:sz w:val="20"/>
+                <w:szCs w:val="20"/>
+              </w:rPr>
+              <w:t>Terminal 3</w:t>
+            </w:r>
+          </w:p>
+        </w:tc>
+        <w:tc>
+          <w:tcPr>
+            <w:tcW w:w="2915" w:type="dxa"/>
+            <w:tcBorders>
+              <w:top w:val="single" w:sz="4" w:space="0" w:color="000000"/>
+              <w:left w:val="single" w:sz="4" w:space="0" w:color="000000"/>
+              <w:bottom w:val="single" w:sz="4" w:space="0" w:color="000000"/>
+              <w:right w:val="single" w:sz="4" w:space="0" w:color="000000"/>
+            </w:tcBorders>
+            <w:tcMar>
+              <w:top w:w="60" w:type="dxa"/>
+              <w:left w:w="90" w:type="dxa"/>
+              <w:bottom w:w="60" w:type="dxa"/>
+              <w:right w:w="90" w:type="dxa"/>
+            </w:tcMar>
+            <w:vAlign w:val="center"/>
+          </w:tcPr>
+          <w:p>
+            <w:r>
+              <w:rPr>
+                <w:sz w:val="20"/>
+                <w:szCs w:val="20"/>
+              </w:rPr>
+              <w:t>C:\Proyectos\LeGrandHotel\api</w:t>
+            </w:r>
+          </w:p>
+        </w:tc>
+        <w:tc>
+          <w:tcPr>
+            <w:tcW w:w="2753" w:type="dxa"/>
+            <w:tcBorders>
+              <w:top w:val="single" w:sz="4" w:space="0" w:color="000000"/>
+              <w:left w:val="single" w:sz="4" w:space="0" w:color="000000"/>
+              <w:bottom w:val="single" w:sz="4" w:space="0" w:color="000000"/>
+              <w:right w:val="single" w:sz="4" w:space="0" w:color="000000"/>
+            </w:tcBorders>
+            <w:tcMar>
+              <w:top w:w="60" w:type="dxa"/>
+              <w:left w:w="90" w:type="dxa"/>
+              <w:bottom w:w="60" w:type="dxa"/>
+              <w:right w:w="90" w:type="dxa"/>
+            </w:tcMar>
+            <w:vAlign w:val="center"/>
+          </w:tcPr>
+          <w:p>
+            <w:r>
+              <w:rPr>
+                <w:sz w:val="20"/>
+                <w:szCs w:val="20"/>
+              </w:rPr>
+              <w:t>La API del puerto 8001 con el límite real de login</w:t>
+            </w:r>
+          </w:p>
+        </w:tc>
+        <w:tc>
+          <w:tcPr>
+            <w:tcW w:w="1944" w:type="dxa"/>
+            <w:tcBorders>
+              <w:top w:val="single" w:sz="4" w:space="0" w:color="000000"/>
+              <w:left w:val="single" w:sz="4" w:space="0" w:color="000000"/>
+              <w:bottom w:val="single" w:sz="4" w:space="0" w:color="000000"/>
+              <w:right w:val="single" w:sz="4" w:space="0" w:color="000000"/>
+            </w:tcBorders>
+            <w:tcMar>
+              <w:top w:w="60" w:type="dxa"/>
+              <w:left w:w="90" w:type="dxa"/>
+              <w:bottom w:w="60" w:type="dxa"/>
+              <w:right w:w="90" w:type="dxa"/>
+            </w:tcMar>
+            <w:vAlign w:val="center"/>
+          </w:tcPr>
+          <w:p>
+            <w:r>
+              <w:rPr>
+                <w:sz w:val="20"/>
+                <w:szCs w:val="20"/>
+              </w:rPr>
+              <w:t>Solo durante el paso 9; luego se cierra con Ctrl + C</w:t>
+            </w:r>
+          </w:p>
+        </w:tc>
+      </w:tr>
+    </w:tbl>
+    <w:p>
+      <w:pPr>
+        <w:spacing w:after="80"/>
+      </w:pPr>
+    </w:p>
+    <w:p>
+      <w:pPr>
+        <w:keepNext/>
+        <w:spacing w:after="120" w:line="300" w:lineRule="auto"/>
+      </w:pPr>
+      <w:r>
+        <w:lastRenderedPageBreak/>
         <w:t>Todo el recorrido en PowerShell, en orden:</w:t>
       </w:r>
     </w:p>
@@ -8200,7 +8733,7 @@
           <w:sz w:val="19"/>
           <w:szCs w:val="19"/>
         </w:rPr>
-        <w:t># Terminal 1 (preparación y API)</w:t>
+        <w:t># Terminal 1 (preparación y API) - abre en la carpeta del proyecto</w:t>
       </w:r>
     </w:p>
     <w:p>
@@ -8217,7 +8750,7 @@
           <w:sz w:val="19"/>
           <w:szCs w:val="19"/>
         </w:rPr>
-        <w:t>docker compose up -d mysql</w:t>
+        <w:t>cd C:\Proyectos\LeGrandHotel</w:t>
       </w:r>
     </w:p>
     <w:p>
@@ -8234,7 +8767,7 @@
           <w:sz w:val="19"/>
           <w:szCs w:val="19"/>
         </w:rPr>
-        <w:t>cd api</w:t>
+        <w:t>docker compose up -d mysql</w:t>
       </w:r>
     </w:p>
     <w:p>
@@ -8251,7 +8784,7 @@
           <w:sz w:val="19"/>
           <w:szCs w:val="19"/>
         </w:rPr>
-        <w:t>php artisan migrate</w:t>
+        <w:t>cd api</w:t>
       </w:r>
     </w:p>
     <w:p>
@@ -8268,7 +8801,7 @@
           <w:sz w:val="19"/>
           <w:szCs w:val="19"/>
         </w:rPr>
-        <w:t>php artisan db:seed --class=DemoSeeder</w:t>
+        <w:t>php artisan migrate</w:t>
       </w:r>
     </w:p>
     <w:p>
@@ -8285,7 +8818,7 @@
           <w:sz w:val="19"/>
           <w:szCs w:val="19"/>
         </w:rPr>
-        <w:t>php artisan db:seed --class=MassiveDataSeeder</w:t>
+        <w:t>php artisan db:seed --class=DemoSeeder</w:t>
       </w:r>
     </w:p>
     <w:p>
@@ -8302,7 +8835,7 @@
           <w:sz w:val="19"/>
           <w:szCs w:val="19"/>
         </w:rPr>
-        <w:t>$env:K6_USERS="50"; php artisan db:seed --class=LoadTestUsersSeeder</w:t>
+        <w:t>php artisan db:seed --class=MassiveDataSeeder</w:t>
       </w:r>
     </w:p>
     <w:p>
@@ -8319,7 +8852,7 @@
           <w:sz w:val="19"/>
           <w:szCs w:val="19"/>
         </w:rPr>
-        <w:t># (editar api\.env: RATE_LIMIT_* = 100000)</w:t>
+        <w:t>$env:K6_USERS="50"; php artisan db:seed --class=LoadTestUsersSeeder</w:t>
       </w:r>
     </w:p>
     <w:p>
@@ -8336,7 +8869,7 @@
           <w:sz w:val="19"/>
           <w:szCs w:val="19"/>
         </w:rPr>
-        <w:t>php artisan config:clear</w:t>
+        <w:t># (editar api\.env: RATE_LIMIT_* = 100000)</w:t>
       </w:r>
     </w:p>
     <w:p>
@@ -8353,7 +8886,7 @@
           <w:sz w:val="19"/>
           <w:szCs w:val="19"/>
         </w:rPr>
-        <w:t>php -S 127.0.0.1:8000 -t public public/index.php</w:t>
+        <w:t>php artisan config:clear</w:t>
       </w:r>
     </w:p>
     <w:p>
@@ -8364,6 +8897,14 @@
         <w:spacing w:line="250" w:lineRule="auto"/>
         <w:ind w:left="200"/>
       </w:pPr>
+      <w:r>
+        <w:rPr>
+          <w:rFonts w:ascii="Consolas" w:eastAsia="Consolas" w:hAnsi="Consolas" w:cs="Consolas"/>
+          <w:sz w:val="19"/>
+          <w:szCs w:val="19"/>
+        </w:rPr>
+        <w:t>php -S 127.0.0.1:8000 -t public public/index.php</w:t>
+      </w:r>
     </w:p>
     <w:p>
       <w:pPr>
@@ -8373,14 +8914,6 @@
         <w:spacing w:line="250" w:lineRule="auto"/>
         <w:ind w:left="200"/>
       </w:pPr>
-      <w:r>
-        <w:rPr>
-          <w:rFonts w:ascii="Consolas" w:eastAsia="Consolas" w:hAnsi="Consolas" w:cs="Consolas"/>
-          <w:sz w:val="19"/>
-          <w:szCs w:val="19"/>
-        </w:rPr>
-        <w:t># Terminal 2 (pruebas, desde la carpeta del proyecto)</w:t>
-      </w:r>
     </w:p>
     <w:p>
       <w:pPr>
@@ -8396,7 +8929,7 @@
           <w:sz w:val="19"/>
           <w:szCs w:val="19"/>
         </w:rPr>
-        <w:t>curl.exe -s http://127.0.0.1:8000/api/v1/health</w:t>
+        <w:t># Terminal 2 (pruebas) - se queda en la carpeta del proyecto, NO entra a api</w:t>
       </w:r>
     </w:p>
     <w:p>
@@ -8413,7 +8946,7 @@
           <w:sz w:val="19"/>
           <w:szCs w:val="19"/>
         </w:rPr>
-        <w:t>k6 run -e BASE_URL=http://127.0.0.1:8000/api/v1 -e VUS=5 -e DURATION=30s tests/k6/smoke.js</w:t>
+        <w:t>cd C:\Proyectos\LeGrandHotel</w:t>
       </w:r>
     </w:p>
     <w:p>
@@ -8430,7 +8963,170 @@
           <w:sz w:val="19"/>
           <w:szCs w:val="19"/>
         </w:rPr>
-        <w:t>k6 run -e BASE_URL=http://127.0.0.1:8001/api/v1 tests/k6/rate-limit.js   # con la API 8001 encendida</w:t>
+        <w:t>curl.exe -s http://127.0.0.1:8000/api/v1/health</w:t>
+      </w:r>
+    </w:p>
+    <w:p>
+      <w:pPr>
+        <w:keepNext/>
+        <w:keepLines/>
+        <w:shd w:val="clear" w:color="auto" w:fill="F2F2F2"/>
+        <w:spacing w:line="250" w:lineRule="auto"/>
+        <w:ind w:left="200"/>
+      </w:pPr>
+      <w:r>
+        <w:rPr>
+          <w:rFonts w:ascii="Consolas" w:eastAsia="Consolas" w:hAnsi="Consolas" w:cs="Consolas"/>
+          <w:sz w:val="19"/>
+          <w:szCs w:val="19"/>
+        </w:rPr>
+        <w:t>k6 run -e BASE_URL=http://127.0.0.1:8000/api/v1 -e VUS=5 -e DURATION=30s tests/k6/smoke.js</w:t>
+      </w:r>
+    </w:p>
+    <w:p>
+      <w:pPr>
+        <w:keepNext/>
+        <w:keepLines/>
+        <w:shd w:val="clear" w:color="auto" w:fill="F2F2F2"/>
+        <w:spacing w:line="250" w:lineRule="auto"/>
+        <w:ind w:left="200"/>
+      </w:pPr>
+    </w:p>
+    <w:p>
+      <w:pPr>
+        <w:keepNext/>
+        <w:keepLines/>
+        <w:shd w:val="clear" w:color="auto" w:fill="F2F2F2"/>
+        <w:spacing w:line="250" w:lineRule="auto"/>
+        <w:ind w:left="200"/>
+      </w:pPr>
+      <w:r>
+        <w:rPr>
+          <w:rFonts w:ascii="Consolas" w:eastAsia="Consolas" w:hAnsi="Consolas" w:cs="Consolas"/>
+          <w:sz w:val="19"/>
+          <w:szCs w:val="19"/>
+        </w:rPr>
+        <w:t># Terminal 3 (solo para la prueba del login) - dentro de api</w:t>
+      </w:r>
+    </w:p>
+    <w:p>
+      <w:pPr>
+        <w:keepNext/>
+        <w:keepLines/>
+        <w:shd w:val="clear" w:color="auto" w:fill="F2F2F2"/>
+        <w:spacing w:line="250" w:lineRule="auto"/>
+        <w:ind w:left="200"/>
+      </w:pPr>
+      <w:r>
+        <w:rPr>
+          <w:rFonts w:ascii="Consolas" w:eastAsia="Consolas" w:hAnsi="Consolas" w:cs="Consolas"/>
+          <w:sz w:val="19"/>
+          <w:szCs w:val="19"/>
+        </w:rPr>
+        <w:t>cd C:\Proyectos\LeGrandHotel\api</w:t>
+      </w:r>
+    </w:p>
+    <w:p>
+      <w:pPr>
+        <w:keepNext/>
+        <w:keepLines/>
+        <w:shd w:val="clear" w:color="auto" w:fill="F2F2F2"/>
+        <w:spacing w:line="250" w:lineRule="auto"/>
+        <w:ind w:left="200"/>
+      </w:pPr>
+      <w:r>
+        <w:rPr>
+          <w:rFonts w:ascii="Consolas" w:eastAsia="Consolas" w:hAnsi="Consolas" w:cs="Consolas"/>
+          <w:sz w:val="19"/>
+          <w:szCs w:val="19"/>
+        </w:rPr>
+        <w:t>$env:RATE_LIMIT_LOGIN="5"; php -S 127.0.0.1:8001 -t public public/index.php</w:t>
+      </w:r>
+    </w:p>
+    <w:p>
+      <w:pPr>
+        <w:keepNext/>
+        <w:keepLines/>
+        <w:shd w:val="clear" w:color="auto" w:fill="F2F2F2"/>
+        <w:spacing w:line="250" w:lineRule="auto"/>
+        <w:ind w:left="200"/>
+      </w:pPr>
+    </w:p>
+    <w:p>
+      <w:pPr>
+        <w:keepNext/>
+        <w:keepLines/>
+        <w:shd w:val="clear" w:color="auto" w:fill="F2F2F2"/>
+        <w:spacing w:line="250" w:lineRule="auto"/>
+        <w:ind w:left="200"/>
+      </w:pPr>
+      <w:r>
+        <w:rPr>
+          <w:rFonts w:ascii="Consolas" w:eastAsia="Consolas" w:hAnsi="Consolas" w:cs="Consolas"/>
+          <w:sz w:val="19"/>
+          <w:szCs w:val="19"/>
+        </w:rPr>
+        <w:t># De vuelta en la Terminal 2, con la Terminal 3 encendida:</w:t>
+      </w:r>
+    </w:p>
+    <w:p>
+      <w:pPr>
+        <w:keepNext/>
+        <w:keepLines/>
+        <w:shd w:val="clear" w:color="auto" w:fill="F2F2F2"/>
+        <w:spacing w:line="250" w:lineRule="auto"/>
+        <w:ind w:left="200"/>
+      </w:pPr>
+      <w:r>
+        <w:rPr>
+          <w:rFonts w:ascii="Consolas" w:eastAsia="Consolas" w:hAnsi="Consolas" w:cs="Consolas"/>
+          <w:sz w:val="19"/>
+          <w:szCs w:val="19"/>
+        </w:rPr>
+        <w:t>k6 run -e BASE_URL=http://127.0.0.1:8001/api/v1 tests/k6/rate-limit.js</w:t>
+      </w:r>
+    </w:p>
+    <w:p>
+      <w:pPr>
+        <w:keepNext/>
+        <w:keepLines/>
+        <w:shd w:val="clear" w:color="auto" w:fill="F2F2F2"/>
+        <w:spacing w:line="250" w:lineRule="auto"/>
+        <w:ind w:left="200"/>
+      </w:pPr>
+      <w:r>
+        <w:rPr>
+          <w:rFonts w:ascii="Consolas" w:eastAsia="Consolas" w:hAnsi="Consolas" w:cs="Consolas"/>
+          <w:sz w:val="19"/>
+          <w:szCs w:val="19"/>
+        </w:rPr>
+        <w:t># (luego cierra la Terminal 3 con Ctrl + C)</w:t>
+      </w:r>
+    </w:p>
+    <w:p>
+      <w:pPr>
+        <w:keepNext/>
+        <w:keepLines/>
+        <w:shd w:val="clear" w:color="auto" w:fill="F2F2F2"/>
+        <w:spacing w:line="250" w:lineRule="auto"/>
+        <w:ind w:left="200"/>
+      </w:pPr>
+    </w:p>
+    <w:p>
+      <w:pPr>
+        <w:keepNext/>
+        <w:keepLines/>
+        <w:shd w:val="clear" w:color="auto" w:fill="F2F2F2"/>
+        <w:spacing w:line="250" w:lineRule="auto"/>
+        <w:ind w:left="200"/>
+      </w:pPr>
+      <w:r>
+        <w:rPr>
+          <w:rFonts w:ascii="Consolas" w:eastAsia="Consolas" w:hAnsi="Consolas" w:cs="Consolas"/>
+          <w:sz w:val="19"/>
+          <w:szCs w:val="19"/>
+        </w:rPr>
+        <w:t># Terminal 2: pruebas por escalones</w:t>
       </w:r>
     </w:p>
     <w:p>
@@ -8581,10 +9277,96 @@
 <file path=word/numbering.xml><?xml version="1.0" encoding="utf-8"?>
 <w:numbering xmlns:wpc="http://schemas.microsoft.com/office/word/2010/wordprocessingCanvas" xmlns:cx="http://schemas.microsoft.com/office/drawing/2014/chartex" xmlns:cx1="http://schemas.microsoft.com/office/drawing/2015/9/8/chartex" xmlns:cx2="http://schemas.microsoft.com/office/drawing/2015/10/21/chartex" xmlns:cx3="http://schemas.microsoft.com/office/drawing/2016/5/9/chartex" xmlns:cx4="http://schemas.microsoft.com/office/drawing/2016/5/10/chartex" xmlns:cx5="http://schemas.microsoft.com/office/drawing/2016/5/11/chartex" xmlns:cx6="http://schemas.microsoft.com/office/drawing/2016/5/12/chartex" xmlns:cx7="http://schemas.microsoft.com/office/drawing/2016/5/13/chartex" xmlns:cx8="http://schemas.microsoft.com/office/drawing/2016/5/14/chartex" xmlns:mc="http://schemas.openxmlformats.org/markup-compatibility/2006" xmlns:aink="http://schemas.microsoft.com/office/drawing/2016/ink" xmlns:am3d="http://schemas.microsoft.com/office/drawing/2017/model3d" xmlns:o="urn:schemas-microsoft-com:office:office" xmlns:oel="http://schemas.microsoft.com/office/2019/extlst" xmlns:r="http://schemas.openxmlformats.org/officeDocument/2006/relationships" xmlns:m="http://schemas.openxmlformats.org/officeDocument/2006/math" xmlns:v="urn:schemas-microsoft-com:vml" xmlns:wp14="http://schemas.microsoft.com/office/word/2010/wordprocessingDrawing" xmlns:wp="http://schemas.openxmlformats.org/drawingml/2006/wordprocessingDrawing" xmlns:w10="urn:schemas-microsoft-com:office:word" xmlns:w="http://schemas.openxmlformats.org/wordprocessingml/2006/main" xmlns:w14="http://schemas.microsoft.com/office/word/2010/wordml" xmlns:w15="http://schemas.microsoft.com/office/word/2012/wordml" xmlns:w16cex="http://schemas.microsoft.com/office/word/2018/wordml/cex" xmlns:w16cid="http://schemas.microsoft.com/office/word/2016/wordml/cid" xmlns:w16="http://schemas.microsoft.com/office/word/2018/wordml" xmlns:w16sdtdh="http://schemas.microsoft.com/office/word/2020/wordml/sdtdatahash" xmlns:w16se="http://schemas.microsoft.com/office/word/2015/wordml/symex" xmlns:wpg="http://schemas.microsoft.com/office/word/2010/wordprocessingGroup" xmlns:wpi="http://schemas.microsoft.com/office/word/2010/wordprocessingInk" xmlns:wne="http://schemas.microsoft.com/office/word/2006/wordml" xmlns:wps="http://schemas.microsoft.com/office/word/2010/wordprocessingShape" mc:Ignorable="w14 w15 w16se w16cid w16 w16cex w16sdtdh wp14">
   <w:abstractNum w:abstractNumId="0" w15:restartNumberingAfterBreak="0">
-    <w:nsid w:val="392C114D"/>
+    <w:nsid w:val="49ED5D43"/>
     <w:multiLevelType w:val="hybridMultilevel"/>
-    <w:tmpl w:val="BAB65FCC"/>
-    <w:lvl w:ilvl="0" w:tplc="A49A21DA">
+    <w:tmpl w:val="36A6F020"/>
+    <w:lvl w:ilvl="0" w:tplc="B98809DA" w:tentative="1">
+      <w:start w:val="1"/>
+      <w:numFmt w:val="bullet"/>
+      <w:lvlText w:val="●"/>
+      <w:lvlJc w:val="left"/>
+      <w:pPr>
+        <w:ind w:left="720" w:hanging="360"/>
+      </w:pPr>
+    </w:lvl>
+    <w:lvl w:ilvl="1" w:tplc="56BA7AA6" w:tentative="1">
+      <w:start w:val="1"/>
+      <w:numFmt w:val="bullet"/>
+      <w:lvlText w:val="○"/>
+      <w:lvlJc w:val="left"/>
+      <w:pPr>
+        <w:ind w:left="1440" w:hanging="360"/>
+      </w:pPr>
+    </w:lvl>
+    <w:lvl w:ilvl="2" w:tplc="D508379A" w:tentative="1">
+      <w:start w:val="1"/>
+      <w:numFmt w:val="bullet"/>
+      <w:lvlText w:val="■"/>
+      <w:lvlJc w:val="left"/>
+      <w:pPr>
+        <w:ind w:left="2160" w:hanging="360"/>
+      </w:pPr>
+    </w:lvl>
+    <w:lvl w:ilvl="3" w:tplc="81285E38" w:tentative="1">
+      <w:start w:val="1"/>
+      <w:numFmt w:val="bullet"/>
+      <w:lvlText w:val="●"/>
+      <w:lvlJc w:val="left"/>
+      <w:pPr>
+        <w:ind w:left="2880" w:hanging="360"/>
+      </w:pPr>
+    </w:lvl>
+    <w:lvl w:ilvl="4" w:tplc="F6AE0432" w:tentative="1">
+      <w:start w:val="1"/>
+      <w:numFmt w:val="bullet"/>
+      <w:lvlText w:val="○"/>
+      <w:lvlJc w:val="left"/>
+      <w:pPr>
+        <w:ind w:left="3600" w:hanging="360"/>
+      </w:pPr>
+    </w:lvl>
+    <w:lvl w:ilvl="5" w:tplc="2B40A11A" w:tentative="1">
+      <w:start w:val="1"/>
+      <w:numFmt w:val="bullet"/>
+      <w:lvlText w:val="■"/>
+      <w:lvlJc w:val="left"/>
+      <w:pPr>
+        <w:ind w:left="4320" w:hanging="360"/>
+      </w:pPr>
+    </w:lvl>
+    <w:lvl w:ilvl="6" w:tplc="EC9E13CE" w:tentative="1">
+      <w:start w:val="1"/>
+      <w:numFmt w:val="bullet"/>
+      <w:lvlText w:val="●"/>
+      <w:lvlJc w:val="left"/>
+      <w:pPr>
+        <w:ind w:left="5040" w:hanging="360"/>
+      </w:pPr>
+    </w:lvl>
+    <w:lvl w:ilvl="7" w:tplc="43BCE7DC" w:tentative="1">
+      <w:start w:val="1"/>
+      <w:numFmt w:val="bullet"/>
+      <w:lvlText w:val="●"/>
+      <w:lvlJc w:val="left"/>
+      <w:pPr>
+        <w:ind w:left="5760" w:hanging="360"/>
+      </w:pPr>
+    </w:lvl>
+    <w:lvl w:ilvl="8" w:tplc="99303E8E" w:tentative="1">
+      <w:start w:val="1"/>
+      <w:numFmt w:val="bullet"/>
+      <w:lvlText w:val="●"/>
+      <w:lvlJc w:val="left"/>
+      <w:pPr>
+        <w:ind w:left="6480" w:hanging="360"/>
+      </w:pPr>
+    </w:lvl>
+  </w:abstractNum>
+  <w:abstractNum w:abstractNumId="1" w15:restartNumberingAfterBreak="0">
+    <w:nsid w:val="714A69E1"/>
+    <w:multiLevelType w:val="hybridMultilevel"/>
+    <w:tmpl w:val="3A74EA64"/>
+    <w:lvl w:ilvl="0" w:tplc="92D69BFE">
       <w:start w:val="1"/>
       <w:numFmt w:val="bullet"/>
       <w:lvlText w:val="•"/>
@@ -8593,141 +9375,55 @@
         <w:ind w:left="540" w:hanging="270"/>
       </w:pPr>
     </w:lvl>
-    <w:lvl w:ilvl="1" w:tplc="04965B4C">
+    <w:lvl w:ilvl="1" w:tplc="D0444C74">
       <w:numFmt w:val="decimal"/>
       <w:lvlText w:val=""/>
       <w:lvlJc w:val="left"/>
     </w:lvl>
-    <w:lvl w:ilvl="2" w:tplc="0AD86572">
+    <w:lvl w:ilvl="2" w:tplc="819A6356">
       <w:numFmt w:val="decimal"/>
       <w:lvlText w:val=""/>
       <w:lvlJc w:val="left"/>
     </w:lvl>
-    <w:lvl w:ilvl="3" w:tplc="565A205C">
+    <w:lvl w:ilvl="3" w:tplc="62E2FAEE">
       <w:numFmt w:val="decimal"/>
       <w:lvlText w:val=""/>
       <w:lvlJc w:val="left"/>
     </w:lvl>
-    <w:lvl w:ilvl="4" w:tplc="E83871BE">
+    <w:lvl w:ilvl="4" w:tplc="0896A638">
       <w:numFmt w:val="decimal"/>
       <w:lvlText w:val=""/>
       <w:lvlJc w:val="left"/>
     </w:lvl>
-    <w:lvl w:ilvl="5" w:tplc="25D494B6">
+    <w:lvl w:ilvl="5" w:tplc="5B52D360">
       <w:numFmt w:val="decimal"/>
       <w:lvlText w:val=""/>
       <w:lvlJc w:val="left"/>
     </w:lvl>
-    <w:lvl w:ilvl="6" w:tplc="8BA010A4">
+    <w:lvl w:ilvl="6" w:tplc="BF7A4E54">
       <w:numFmt w:val="decimal"/>
       <w:lvlText w:val=""/>
       <w:lvlJc w:val="left"/>
     </w:lvl>
-    <w:lvl w:ilvl="7" w:tplc="DC02C026">
+    <w:lvl w:ilvl="7" w:tplc="85E8BECC">
       <w:numFmt w:val="decimal"/>
       <w:lvlText w:val=""/>
       <w:lvlJc w:val="left"/>
     </w:lvl>
-    <w:lvl w:ilvl="8" w:tplc="215C5286">
+    <w:lvl w:ilvl="8" w:tplc="3EC0DE16">
       <w:numFmt w:val="decimal"/>
       <w:lvlText w:val=""/>
       <w:lvlJc w:val="left"/>
     </w:lvl>
   </w:abstractNum>
-  <w:abstractNum w:abstractNumId="1" w15:restartNumberingAfterBreak="0">
-    <w:nsid w:val="65BC2C2D"/>
-    <w:multiLevelType w:val="hybridMultilevel"/>
-    <w:tmpl w:val="D5DE2978"/>
-    <w:lvl w:ilvl="0" w:tplc="396647D2" w:tentative="1">
-      <w:start w:val="1"/>
-      <w:numFmt w:val="bullet"/>
-      <w:lvlText w:val="●"/>
-      <w:lvlJc w:val="left"/>
-      <w:pPr>
-        <w:ind w:left="720" w:hanging="360"/>
-      </w:pPr>
-    </w:lvl>
-    <w:lvl w:ilvl="1" w:tplc="B6B49C60" w:tentative="1">
-      <w:start w:val="1"/>
-      <w:numFmt w:val="bullet"/>
-      <w:lvlText w:val="○"/>
-      <w:lvlJc w:val="left"/>
-      <w:pPr>
-        <w:ind w:left="1440" w:hanging="360"/>
-      </w:pPr>
-    </w:lvl>
-    <w:lvl w:ilvl="2" w:tplc="B6489642" w:tentative="1">
-      <w:start w:val="1"/>
-      <w:numFmt w:val="bullet"/>
-      <w:lvlText w:val="■"/>
-      <w:lvlJc w:val="left"/>
-      <w:pPr>
-        <w:ind w:left="2160" w:hanging="360"/>
-      </w:pPr>
-    </w:lvl>
-    <w:lvl w:ilvl="3" w:tplc="D5B2BBB8" w:tentative="1">
-      <w:start w:val="1"/>
-      <w:numFmt w:val="bullet"/>
-      <w:lvlText w:val="●"/>
-      <w:lvlJc w:val="left"/>
-      <w:pPr>
-        <w:ind w:left="2880" w:hanging="360"/>
-      </w:pPr>
-    </w:lvl>
-    <w:lvl w:ilvl="4" w:tplc="F0A81BAE" w:tentative="1">
-      <w:start w:val="1"/>
-      <w:numFmt w:val="bullet"/>
-      <w:lvlText w:val="○"/>
-      <w:lvlJc w:val="left"/>
-      <w:pPr>
-        <w:ind w:left="3600" w:hanging="360"/>
-      </w:pPr>
-    </w:lvl>
-    <w:lvl w:ilvl="5" w:tplc="682E2F30" w:tentative="1">
-      <w:start w:val="1"/>
-      <w:numFmt w:val="bullet"/>
-      <w:lvlText w:val="■"/>
-      <w:lvlJc w:val="left"/>
-      <w:pPr>
-        <w:ind w:left="4320" w:hanging="360"/>
-      </w:pPr>
-    </w:lvl>
-    <w:lvl w:ilvl="6" w:tplc="CAACB35A" w:tentative="1">
-      <w:start w:val="1"/>
-      <w:numFmt w:val="bullet"/>
-      <w:lvlText w:val="●"/>
-      <w:lvlJc w:val="left"/>
-      <w:pPr>
-        <w:ind w:left="5040" w:hanging="360"/>
-      </w:pPr>
-    </w:lvl>
-    <w:lvl w:ilvl="7" w:tplc="0088B228" w:tentative="1">
-      <w:start w:val="1"/>
-      <w:numFmt w:val="bullet"/>
-      <w:lvlText w:val="●"/>
-      <w:lvlJc w:val="left"/>
-      <w:pPr>
-        <w:ind w:left="5760" w:hanging="360"/>
-      </w:pPr>
-    </w:lvl>
-    <w:lvl w:ilvl="8" w:tplc="46548A06" w:tentative="1">
-      <w:start w:val="1"/>
-      <w:numFmt w:val="bullet"/>
-      <w:lvlText w:val="●"/>
-      <w:lvlJc w:val="left"/>
-      <w:pPr>
-        <w:ind w:left="6480" w:hanging="360"/>
-      </w:pPr>
-    </w:lvl>
-  </w:abstractNum>
-  <w:num w:numId="1" w16cid:durableId="523129822">
-    <w:abstractNumId w:val="1"/>
+  <w:num w:numId="1" w16cid:durableId="1301568888">
+    <w:abstractNumId w:val="0"/>
     <w:lvlOverride w:ilvl="0">
       <w:startOverride w:val="1"/>
     </w:lvlOverride>
   </w:num>
-  <w:num w:numId="2" w16cid:durableId="877545339">
-    <w:abstractNumId w:val="0"/>
+  <w:num w:numId="2" w16cid:durableId="1240359286">
+    <w:abstractNumId w:val="1"/>
     <w:lvlOverride w:ilvl="0">
       <w:startOverride w:val="1"/>
     </w:lvlOverride>

</xml_diff>